<commit_message>
added few new reports and updated pricing startegy and based on pricing all the page and report will work
</commit_message>
<xml_diff>
--- a/Documents/Product-Requirement-Document.docx
+++ b/Documents/Product-Requirement-Document.docx
@@ -1,6 +1,6 @@
 
 <file path=word/document.xml><?xml version="1.0" encoding="utf-8"?>
-<w:document xmlns:wpc="http://schemas.microsoft.com/office/word/2010/wordprocessingCanvas" xmlns:cx="http://schemas.microsoft.com/office/drawing/2014/chartex" xmlns:cx1="http://schemas.microsoft.com/office/drawing/2015/9/8/chartex" xmlns:cx2="http://schemas.microsoft.com/office/drawing/2015/10/21/chartex" xmlns:cx3="http://schemas.microsoft.com/office/drawing/2016/5/9/chartex" xmlns:cx4="http://schemas.microsoft.com/office/drawing/2016/5/10/chartex" xmlns:cx5="http://schemas.microsoft.com/office/drawing/2016/5/11/chartex" xmlns:cx6="http://schemas.microsoft.com/office/drawing/2016/5/12/chartex" xmlns:cx7="http://schemas.microsoft.com/office/drawing/2016/5/13/chartex" xmlns:cx8="http://schemas.microsoft.com/office/drawing/2016/5/14/chartex" xmlns:mc="http://schemas.openxmlformats.org/markup-compatibility/2006" xmlns:aink="http://schemas.microsoft.com/office/drawing/2016/ink" xmlns:am3d="http://schemas.microsoft.com/office/drawing/2017/model3d" xmlns:o="urn:schemas-microsoft-com:office:office" xmlns:oel="http://schemas.microsoft.com/office/2019/extlst" xmlns:r="http://schemas.openxmlformats.org/officeDocument/2006/relationships" xmlns:m="http://schemas.openxmlformats.org/officeDocument/2006/math" xmlns:v="urn:schemas-microsoft-com:vml" xmlns:wp14="http://schemas.microsoft.com/office/word/2010/wordprocessingDrawing" xmlns:wp="http://schemas.openxmlformats.org/drawingml/2006/wordprocessingDrawing" xmlns:w10="urn:schemas-microsoft-com:office:word" xmlns:w="http://schemas.openxmlformats.org/wordprocessingml/2006/main" xmlns:w14="http://schemas.microsoft.com/office/word/2010/wordml" xmlns:w15="http://schemas.microsoft.com/office/word/2012/wordml" xmlns:w16cex="http://schemas.microsoft.com/office/word/2018/wordml/cex" xmlns:w16cid="http://schemas.microsoft.com/office/word/2016/wordml/cid" xmlns:w16="http://schemas.microsoft.com/office/word/2018/wordml" xmlns:w16du="http://schemas.microsoft.com/office/word/2023/wordml/word16du" xmlns:w16sdtdh="http://schemas.microsoft.com/office/word/2020/wordml/sdtdatahash" xmlns:w16sdtfl="http://schemas.microsoft.com/office/word/2024/wordml/sdtformatlock" xmlns:w16se="http://schemas.microsoft.com/office/word/2015/wordml/symex" xmlns:wpg="http://schemas.microsoft.com/office/word/2010/wordprocessingGroup" xmlns:wpi="http://schemas.microsoft.com/office/word/2010/wordprocessingInk" xmlns:wne="http://schemas.microsoft.com/office/word/2006/wordml" xmlns:wps="http://schemas.microsoft.com/office/word/2010/wordprocessingShape" mc:Ignorable="w14 w15 w16se w16cid w16 w16cex w16sdtdh w16sdtfl w16du wp14">
+<w:document xmlns:wpc="http://schemas.microsoft.com/office/word/2010/wordprocessingCanvas" xmlns:cx="http://schemas.microsoft.com/office/drawing/2014/chartex" xmlns:cx1="http://schemas.microsoft.com/office/drawing/2015/9/8/chartex" xmlns:cx2="http://schemas.microsoft.com/office/drawing/2015/10/21/chartex" xmlns:cx3="http://schemas.microsoft.com/office/drawing/2016/5/9/chartex" xmlns:cx4="http://schemas.microsoft.com/office/drawing/2016/5/10/chartex" xmlns:cx5="http://schemas.microsoft.com/office/drawing/2016/5/11/chartex" xmlns:cx6="http://schemas.microsoft.com/office/drawing/2016/5/12/chartex" xmlns:cx7="http://schemas.microsoft.com/office/drawing/2016/5/13/chartex" xmlns:cx8="http://schemas.microsoft.com/office/drawing/2016/5/14/chartex" xmlns:mc="http://schemas.openxmlformats.org/markup-compatibility/2006" xmlns:aink="http://schemas.microsoft.com/office/drawing/2016/ink" xmlns:am3d="http://schemas.microsoft.com/office/drawing/2017/model3d" xmlns:o="urn:schemas-microsoft-com:office:office" xmlns:oel="http://schemas.microsoft.com/office/2019/extlst" xmlns:r="http://schemas.openxmlformats.org/officeDocument/2006/relationships" xmlns:m="http://schemas.openxmlformats.org/officeDocument/2006/math" xmlns:v="urn:schemas-microsoft-com:vml" xmlns:wp14="http://schemas.microsoft.com/office/word/2010/wordprocessingDrawing" xmlns:wp="http://schemas.openxmlformats.org/drawingml/2006/wordprocessingDrawing" xmlns:w10="urn:schemas-microsoft-com:office:word" xmlns:w="http://schemas.openxmlformats.org/wordprocessingml/2006/main" xmlns:w14="http://schemas.microsoft.com/office/word/2010/wordml" xmlns:w15="http://schemas.microsoft.com/office/word/2012/wordml" xmlns:w16cei="http://schemas.microsoft.com/office/word/2026/wordml/cei" xmlns:w16cex="http://schemas.microsoft.com/office/word/2018/wordml/cex" xmlns:w16cid="http://schemas.microsoft.com/office/word/2016/wordml/cid" xmlns:w16="http://schemas.microsoft.com/office/word/2018/wordml" xmlns:w16du="http://schemas.microsoft.com/office/word/2023/wordml/word16du" xmlns:w16sdtdh="http://schemas.microsoft.com/office/word/2020/wordml/sdtdatahash" xmlns:w16sdtfl="http://schemas.microsoft.com/office/word/2024/wordml/sdtformatlock" xmlns:w16se="http://schemas.microsoft.com/office/word/2015/wordml/symex" xmlns:wpg="http://schemas.microsoft.com/office/word/2010/wordprocessingGroup" xmlns:wpi="http://schemas.microsoft.com/office/word/2010/wordprocessingInk" xmlns:wne="http://schemas.microsoft.com/office/word/2006/wordml" xmlns:wps="http://schemas.microsoft.com/office/word/2010/wordprocessingShape" mc:Ignorable="w14 w15 w16se w16cid w16 w16cex w16sdtdh w16sdtfl w16du wp14">
   <w:body>
     <w:p>
       <w:r>
@@ -37,7 +37,7 @@
     <w:p>
       <w:r>
         <w:pict w14:anchorId="6340E8B9">
-          <v:rect id="_x0000_i1157" style="width:0;height:1.5pt" o:hralign="center" o:hrstd="t" o:hr="t" fillcolor="#a0a0a0" stroked="f"/>
+          <v:rect id="_x0000_i1025" style="width:0;height:1.5pt" o:hralign="center" o:hrstd="t" o:hr="t" fillcolor="#a0a0a0" stroked="f"/>
         </w:pict>
       </w:r>
     </w:p>
@@ -68,7 +68,14 @@
           <w:b/>
           <w:bCs/>
         </w:rPr>
-        <w:t>NISOL LABS WEBSITE PRD</w:t>
+        <w:t>NISOL AI</w:t>
+      </w:r>
+      <w:r>
+        <w:rPr>
+          <w:b/>
+          <w:bCs/>
+        </w:rPr>
+        <w:t xml:space="preserve"> WEBSITE PRD</w:t>
       </w:r>
     </w:p>
     <w:p>
@@ -94,7 +101,7 @@
     <w:p>
       <w:r>
         <w:pict w14:anchorId="4C2CE024">
-          <v:rect id="_x0000_i1158" style="width:0;height:1.5pt" o:hralign="center" o:hrstd="t" o:hr="t" fillcolor="#a0a0a0" stroked="f"/>
+          <v:rect id="_x0000_i1026" style="width:0;height:1.5pt" o:hralign="center" o:hrstd="t" o:hr="t" fillcolor="#a0a0a0" stroked="f"/>
         </w:pict>
       </w:r>
     </w:p>
@@ -134,7 +141,7 @@
           <w:b/>
           <w:bCs/>
         </w:rPr>
-        <w:t>Nisol Labs</w:t>
+        <w:t>NISOL AI</w:t>
       </w:r>
     </w:p>
     <w:p>
@@ -198,13 +205,16 @@
     </w:p>
     <w:p>
       <w:r>
-        <w:t>Nisol Labs enables organizations to discover, implement, and scale Artificial Intelligence through AI Strategy, Intelligent Assistants, AI Agents, Workflow Automation, and AI Engineering.</w:t>
+        <w:t>NISOL AI</w:t>
+      </w:r>
+      <w:r>
+        <w:t xml:space="preserve"> enables organizations to discover, implement, and scale Artificial Intelligence through AI Strategy, Intelligent Assistants, AI Agents, Workflow Automation, and AI Engineering.</w:t>
       </w:r>
     </w:p>
     <w:p>
       <w:r>
         <w:pict w14:anchorId="709FA43C">
-          <v:rect id="_x0000_i1159" style="width:0;height:1.5pt" o:hralign="center" o:hrstd="t" o:hr="t" fillcolor="#a0a0a0" stroked="f"/>
+          <v:rect id="_x0000_i1027" style="width:0;height:1.5pt" o:hralign="center" o:hrstd="t" o:hr="t" fillcolor="#a0a0a0" stroked="f"/>
         </w:pict>
       </w:r>
     </w:p>
@@ -236,7 +246,13 @@
         </w:numPr>
       </w:pPr>
       <w:r>
-        <w:t>Position Nisol Labs as a premium AI consulting company.</w:t>
+        <w:t xml:space="preserve">Position </w:t>
+      </w:r>
+      <w:r>
+        <w:t>NISOL AI</w:t>
+      </w:r>
+      <w:r>
+        <w:t xml:space="preserve"> as a premium AI consulting company.</w:t>
       </w:r>
     </w:p>
     <w:p>
@@ -292,7 +308,7 @@
       <w:r>
         <w:lastRenderedPageBreak/>
         <w:pict w14:anchorId="376C85DD">
-          <v:rect id="_x0000_i1160" style="width:0;height:1.5pt" o:hralign="center" o:hrstd="t" o:hr="t" fillcolor="#a0a0a0" stroked="f"/>
+          <v:rect id="_x0000_i1028" style="width:0;height:1.5pt" o:hralign="center" o:hrstd="t" o:hr="t" fillcolor="#a0a0a0" stroked="f"/>
         </w:pict>
       </w:r>
     </w:p>
@@ -423,7 +439,7 @@
     <w:p>
       <w:r>
         <w:pict w14:anchorId="595830B2">
-          <v:rect id="_x0000_i1161" style="width:0;height:1.5pt" o:hralign="center" o:hrstd="t" o:hr="t" fillcolor="#a0a0a0" stroked="f"/>
+          <v:rect id="_x0000_i1029" style="width:0;height:1.5pt" o:hralign="center" o:hrstd="t" o:hr="t" fillcolor="#a0a0a0" stroked="f"/>
         </w:pict>
       </w:r>
     </w:p>
@@ -495,7 +511,7 @@
     <w:p>
       <w:r>
         <w:pict w14:anchorId="27510C75">
-          <v:rect id="_x0000_i1162" style="width:0;height:1.5pt" o:hralign="center" o:hrstd="t" o:hr="t" fillcolor="#a0a0a0" stroked="f"/>
+          <v:rect id="_x0000_i1030" style="width:0;height:1.5pt" o:hralign="center" o:hrstd="t" o:hr="t" fillcolor="#a0a0a0" stroked="f"/>
         </w:pict>
       </w:r>
     </w:p>
@@ -640,7 +656,7 @@
     <w:p>
       <w:r>
         <w:pict w14:anchorId="6B57BEA4">
-          <v:rect id="_x0000_i1163" style="width:0;height:1.5pt" o:hralign="center" o:hrstd="t" o:hr="t" fillcolor="#a0a0a0" stroked="f"/>
+          <v:rect id="_x0000_i1031" style="width:0;height:1.5pt" o:hralign="center" o:hrstd="t" o:hr="t" fillcolor="#a0a0a0" stroked="f"/>
         </w:pict>
       </w:r>
     </w:p>
@@ -717,7 +733,7 @@
     <w:p>
       <w:r>
         <w:pict w14:anchorId="20398720">
-          <v:rect id="_x0000_i1164" style="width:0;height:1.5pt" o:hralign="center" o:hrstd="t" o:hr="t" fillcolor="#a0a0a0" stroked="f"/>
+          <v:rect id="_x0000_i1032" style="width:0;height:1.5pt" o:hralign="center" o:hrstd="t" o:hr="t" fillcolor="#a0a0a0" stroked="f"/>
         </w:pict>
       </w:r>
     </w:p>
@@ -882,7 +898,7 @@
     <w:p>
       <w:r>
         <w:pict w14:anchorId="5A019FAE">
-          <v:rect id="_x0000_i1165" style="width:0;height:1.5pt" o:hralign="center" o:hrstd="t" o:hr="t" fillcolor="#a0a0a0" stroked="f"/>
+          <v:rect id="_x0000_i1033" style="width:0;height:1.5pt" o:hralign="center" o:hrstd="t" o:hr="t" fillcolor="#a0a0a0" stroked="f"/>
         </w:pict>
       </w:r>
     </w:p>
@@ -923,7 +939,10 @@
     </w:p>
     <w:p>
       <w:r>
-        <w:t>Why Nisol Labs</w:t>
+        <w:t xml:space="preserve">Why </w:t>
+      </w:r>
+      <w:r>
+        <w:t>NISOL AI</w:t>
       </w:r>
     </w:p>
     <w:p>
@@ -954,7 +973,7 @@
     <w:p>
       <w:r>
         <w:pict w14:anchorId="0B57B3E0">
-          <v:rect id="_x0000_i1166" style="width:0;height:1.5pt" o:hralign="center" o:hrstd="t" o:hr="t" fillcolor="#a0a0a0" stroked="f"/>
+          <v:rect id="_x0000_i1034" style="width:0;height:1.5pt" o:hralign="center" o:hrstd="t" o:hr="t" fillcolor="#a0a0a0" stroked="f"/>
         </w:pict>
       </w:r>
     </w:p>
@@ -997,7 +1016,7 @@
     <w:p>
       <w:r>
         <w:pict w14:anchorId="3E9C4DCD">
-          <v:rect id="_x0000_i1167" style="width:0;height:1.5pt" o:hralign="center" o:hrstd="t" o:hr="t" fillcolor="#a0a0a0" stroked="f"/>
+          <v:rect id="_x0000_i1035" style="width:0;height:1.5pt" o:hralign="center" o:hrstd="t" o:hr="t" fillcolor="#a0a0a0" stroked="f"/>
         </w:pict>
       </w:r>
     </w:p>
@@ -1024,7 +1043,7 @@
     <w:p>
       <w:r>
         <w:pict w14:anchorId="0D617882">
-          <v:rect id="_x0000_i1168" style="width:0;height:1.5pt" o:hralign="center" o:hrstd="t" o:hr="t" fillcolor="#a0a0a0" stroked="f"/>
+          <v:rect id="_x0000_i1036" style="width:0;height:1.5pt" o:hralign="center" o:hrstd="t" o:hr="t" fillcolor="#a0a0a0" stroked="f"/>
         </w:pict>
       </w:r>
     </w:p>
@@ -1051,7 +1070,7 @@
     <w:p>
       <w:r>
         <w:pict w14:anchorId="6F58CE31">
-          <v:rect id="_x0000_i1169" style="width:0;height:1.5pt" o:hralign="center" o:hrstd="t" o:hr="t" fillcolor="#a0a0a0" stroked="f"/>
+          <v:rect id="_x0000_i1037" style="width:0;height:1.5pt" o:hralign="center" o:hrstd="t" o:hr="t" fillcolor="#a0a0a0" stroked="f"/>
         </w:pict>
       </w:r>
     </w:p>
@@ -1078,7 +1097,7 @@
     <w:p>
       <w:r>
         <w:pict w14:anchorId="3CEB2C21">
-          <v:rect id="_x0000_i1170" style="width:0;height:1.5pt" o:hralign="center" o:hrstd="t" o:hr="t" fillcolor="#a0a0a0" stroked="f"/>
+          <v:rect id="_x0000_i1038" style="width:0;height:1.5pt" o:hralign="center" o:hrstd="t" o:hr="t" fillcolor="#a0a0a0" stroked="f"/>
         </w:pict>
       </w:r>
     </w:p>
@@ -1105,7 +1124,7 @@
     <w:p>
       <w:r>
         <w:pict w14:anchorId="2508D16C">
-          <v:rect id="_x0000_i1171" style="width:0;height:1.5pt" o:hralign="center" o:hrstd="t" o:hr="t" fillcolor="#a0a0a0" stroked="f"/>
+          <v:rect id="_x0000_i1039" style="width:0;height:1.5pt" o:hralign="center" o:hrstd="t" o:hr="t" fillcolor="#a0a0a0" stroked="f"/>
         </w:pict>
       </w:r>
     </w:p>
@@ -1185,7 +1204,7 @@
     <w:p>
       <w:r>
         <w:pict w14:anchorId="5E56D122">
-          <v:rect id="_x0000_i1172" style="width:0;height:1.5pt" o:hralign="center" o:hrstd="t" o:hr="t" fillcolor="#a0a0a0" stroked="f"/>
+          <v:rect id="_x0000_i1040" style="width:0;height:1.5pt" o:hralign="center" o:hrstd="t" o:hr="t" fillcolor="#a0a0a0" stroked="f"/>
         </w:pict>
       </w:r>
     </w:p>
@@ -1253,7 +1272,7 @@
     <w:p>
       <w:r>
         <w:pict w14:anchorId="43A1E855">
-          <v:rect id="_x0000_i1173" style="width:0;height:1.5pt" o:hralign="center" o:hrstd="t" o:hr="t" fillcolor="#a0a0a0" stroked="f"/>
+          <v:rect id="_x0000_i1041" style="width:0;height:1.5pt" o:hralign="center" o:hrstd="t" o:hr="t" fillcolor="#a0a0a0" stroked="f"/>
         </w:pict>
       </w:r>
     </w:p>
@@ -1315,7 +1334,7 @@
     <w:p>
       <w:r>
         <w:pict w14:anchorId="355ADCB2">
-          <v:rect id="_x0000_i1174" style="width:0;height:1.5pt" o:hralign="center" o:hrstd="t" o:hr="t" fillcolor="#a0a0a0" stroked="f"/>
+          <v:rect id="_x0000_i1042" style="width:0;height:1.5pt" o:hralign="center" o:hrstd="t" o:hr="t" fillcolor="#a0a0a0" stroked="f"/>
         </w:pict>
       </w:r>
     </w:p>
@@ -1342,7 +1361,7 @@
     <w:p>
       <w:r>
         <w:pict w14:anchorId="79D16E01">
-          <v:rect id="_x0000_i1175" style="width:0;height:1.5pt" o:hralign="center" o:hrstd="t" o:hr="t" fillcolor="#a0a0a0" stroked="f"/>
+          <v:rect id="_x0000_i1043" style="width:0;height:1.5pt" o:hralign="center" o:hrstd="t" o:hr="t" fillcolor="#a0a0a0" stroked="f"/>
         </w:pict>
       </w:r>
     </w:p>
@@ -1502,7 +1521,7 @@
     <w:p>
       <w:r>
         <w:pict w14:anchorId="7276184B">
-          <v:rect id="_x0000_i1176" style="width:0;height:1.5pt" o:hralign="center" o:hrstd="t" o:hr="t" fillcolor="#a0a0a0" stroked="f"/>
+          <v:rect id="_x0000_i1044" style="width:0;height:1.5pt" o:hralign="center" o:hrstd="t" o:hr="t" fillcolor="#a0a0a0" stroked="f"/>
         </w:pict>
       </w:r>
     </w:p>
@@ -1616,7 +1635,7 @@
     <w:p>
       <w:r>
         <w:pict w14:anchorId="378EDFDF">
-          <v:rect id="_x0000_i1177" style="width:0;height:1.5pt" o:hralign="center" o:hrstd="t" o:hr="t" fillcolor="#a0a0a0" stroked="f"/>
+          <v:rect id="_x0000_i1045" style="width:0;height:1.5pt" o:hralign="center" o:hrstd="t" o:hr="t" fillcolor="#a0a0a0" stroked="f"/>
         </w:pict>
       </w:r>
     </w:p>
@@ -1681,7 +1700,7 @@
     <w:p>
       <w:r>
         <w:pict w14:anchorId="7F2F33C4">
-          <v:rect id="_x0000_i1178" style="width:0;height:1.5pt" o:hralign="center" o:hrstd="t" o:hr="t" fillcolor="#a0a0a0" stroked="f"/>
+          <v:rect id="_x0000_i1046" style="width:0;height:1.5pt" o:hralign="center" o:hrstd="t" o:hr="t" fillcolor="#a0a0a0" stroked="f"/>
         </w:pict>
       </w:r>
     </w:p>
@@ -1795,7 +1814,7 @@
 </file>
 
 <file path=word/numbering.xml><?xml version="1.0" encoding="utf-8"?>
-<w:numbering xmlns:wpc="http://schemas.microsoft.com/office/word/2010/wordprocessingCanvas" xmlns:cx="http://schemas.microsoft.com/office/drawing/2014/chartex" xmlns:cx1="http://schemas.microsoft.com/office/drawing/2015/9/8/chartex" xmlns:cx2="http://schemas.microsoft.com/office/drawing/2015/10/21/chartex" xmlns:cx3="http://schemas.microsoft.com/office/drawing/2016/5/9/chartex" xmlns:cx4="http://schemas.microsoft.com/office/drawing/2016/5/10/chartex" xmlns:cx5="http://schemas.microsoft.com/office/drawing/2016/5/11/chartex" xmlns:cx6="http://schemas.microsoft.com/office/drawing/2016/5/12/chartex" xmlns:cx7="http://schemas.microsoft.com/office/drawing/2016/5/13/chartex" xmlns:cx8="http://schemas.microsoft.com/office/drawing/2016/5/14/chartex" xmlns:mc="http://schemas.openxmlformats.org/markup-compatibility/2006" xmlns:aink="http://schemas.microsoft.com/office/drawing/2016/ink" xmlns:am3d="http://schemas.microsoft.com/office/drawing/2017/model3d" xmlns:o="urn:schemas-microsoft-com:office:office" xmlns:oel="http://schemas.microsoft.com/office/2019/extlst" xmlns:r="http://schemas.openxmlformats.org/officeDocument/2006/relationships" xmlns:m="http://schemas.openxmlformats.org/officeDocument/2006/math" xmlns:v="urn:schemas-microsoft-com:vml" xmlns:wp14="http://schemas.microsoft.com/office/word/2010/wordprocessingDrawing" xmlns:wp="http://schemas.openxmlformats.org/drawingml/2006/wordprocessingDrawing" xmlns:w10="urn:schemas-microsoft-com:office:word" xmlns:w="http://schemas.openxmlformats.org/wordprocessingml/2006/main" xmlns:w14="http://schemas.microsoft.com/office/word/2010/wordml" xmlns:w15="http://schemas.microsoft.com/office/word/2012/wordml" xmlns:w16cex="http://schemas.microsoft.com/office/word/2018/wordml/cex" xmlns:w16cid="http://schemas.microsoft.com/office/word/2016/wordml/cid" xmlns:w16="http://schemas.microsoft.com/office/word/2018/wordml" xmlns:w16du="http://schemas.microsoft.com/office/word/2023/wordml/word16du" xmlns:w16sdtdh="http://schemas.microsoft.com/office/word/2020/wordml/sdtdatahash" xmlns:w16sdtfl="http://schemas.microsoft.com/office/word/2024/wordml/sdtformatlock" xmlns:w16se="http://schemas.microsoft.com/office/word/2015/wordml/symex" xmlns:wpg="http://schemas.microsoft.com/office/word/2010/wordprocessingGroup" xmlns:wpi="http://schemas.microsoft.com/office/word/2010/wordprocessingInk" xmlns:wne="http://schemas.microsoft.com/office/word/2006/wordml" xmlns:wps="http://schemas.microsoft.com/office/word/2010/wordprocessingShape" mc:Ignorable="w14 w15 w16se w16cid w16 w16cex w16sdtdh w16sdtfl w16du wp14">
+<w:numbering xmlns:wpc="http://schemas.microsoft.com/office/word/2010/wordprocessingCanvas" xmlns:cx="http://schemas.microsoft.com/office/drawing/2014/chartex" xmlns:cx1="http://schemas.microsoft.com/office/drawing/2015/9/8/chartex" xmlns:cx2="http://schemas.microsoft.com/office/drawing/2015/10/21/chartex" xmlns:cx3="http://schemas.microsoft.com/office/drawing/2016/5/9/chartex" xmlns:cx4="http://schemas.microsoft.com/office/drawing/2016/5/10/chartex" xmlns:cx5="http://schemas.microsoft.com/office/drawing/2016/5/11/chartex" xmlns:cx6="http://schemas.microsoft.com/office/drawing/2016/5/12/chartex" xmlns:cx7="http://schemas.microsoft.com/office/drawing/2016/5/13/chartex" xmlns:cx8="http://schemas.microsoft.com/office/drawing/2016/5/14/chartex" xmlns:mc="http://schemas.openxmlformats.org/markup-compatibility/2006" xmlns:aink="http://schemas.microsoft.com/office/drawing/2016/ink" xmlns:am3d="http://schemas.microsoft.com/office/drawing/2017/model3d" xmlns:o="urn:schemas-microsoft-com:office:office" xmlns:oel="http://schemas.microsoft.com/office/2019/extlst" xmlns:r="http://schemas.openxmlformats.org/officeDocument/2006/relationships" xmlns:m="http://schemas.openxmlformats.org/officeDocument/2006/math" xmlns:v="urn:schemas-microsoft-com:vml" xmlns:wp14="http://schemas.microsoft.com/office/word/2010/wordprocessingDrawing" xmlns:wp="http://schemas.openxmlformats.org/drawingml/2006/wordprocessingDrawing" xmlns:w10="urn:schemas-microsoft-com:office:word" xmlns:w="http://schemas.openxmlformats.org/wordprocessingml/2006/main" xmlns:w14="http://schemas.microsoft.com/office/word/2010/wordml" xmlns:w15="http://schemas.microsoft.com/office/word/2012/wordml" xmlns:w16cei="http://schemas.microsoft.com/office/word/2026/wordml/cei" xmlns:w16cex="http://schemas.microsoft.com/office/word/2018/wordml/cex" xmlns:w16cid="http://schemas.microsoft.com/office/word/2016/wordml/cid" xmlns:w16="http://schemas.microsoft.com/office/word/2018/wordml" xmlns:w16du="http://schemas.microsoft.com/office/word/2023/wordml/word16du" xmlns:w16sdtdh="http://schemas.microsoft.com/office/word/2020/wordml/sdtdatahash" xmlns:w16sdtfl="http://schemas.microsoft.com/office/word/2024/wordml/sdtformatlock" xmlns:w16se="http://schemas.microsoft.com/office/word/2015/wordml/symex" xmlns:wpg="http://schemas.microsoft.com/office/word/2010/wordprocessingGroup" xmlns:wpi="http://schemas.microsoft.com/office/word/2010/wordprocessingInk" xmlns:wne="http://schemas.microsoft.com/office/word/2006/wordml" xmlns:wps="http://schemas.microsoft.com/office/word/2010/wordprocessingShape" mc:Ignorable="w14 w15 w16se w16cid w16 w16cex w16sdtdh w16sdtfl w16du wp14">
   <w:abstractNum w:abstractNumId="0" w15:restartNumberingAfterBreak="0">
     <w:nsid w:val="0C3F0378"/>
     <w:multiLevelType w:val="multilevel"/>
@@ -3466,6 +3485,7 @@
   <w:style w:type="character" w:default="1" w:styleId="DefaultParagraphFont">
     <w:name w:val="Default Paragraph Font"/>
     <w:uiPriority w:val="1"/>
+    <w:semiHidden/>
     <w:unhideWhenUsed/>
   </w:style>
   <w:style w:type="table" w:default="1" w:styleId="TableNormal">

</xml_diff>